<commit_message>
Shorten concept note: remove map, condense study area
Co-Authored-By: Claude Opus 5.5 <noreply@anthropic.com>
Claude-Session: https://claude.ai/code/session_0132bxCMLAKTHUnyQV3MmGfs
</commit_message>
<xml_diff>
--- a/thesis/Concept_Note_Study_Site_and_Research_Gap.docx
+++ b/thesis/Concept_Note_Study_Site_and_Research_Gap.docx
@@ -72,169 +72,15 @@
         <w:spacing w:after="90" w:before="200"/>
       </w:pPr>
       <w:r>
-        <w:t xml:space="preserve">2. Study Area and Why I Selected It</w:t>
-      </w:r>
-    </w:p>
-    <w:p>
-      <w:pPr>
-        <w:pStyle w:val="ListParagraph"/>
-        <w:numPr>
-          <w:ilvl w:val="0"/>
-          <w:numId w:val="2"/>
-        </w:numPr>
-        <w:spacing w:after="60" w:line="264"/>
-      </w:pPr>
-      <w:r>
-        <w:rPr>
-          <w:b/>
-          <w:bCs/>
-        </w:rPr>
-        <w:t xml:space="preserve">Location: </w:t>
-      </w:r>
-      <w:r>
-        <w:t xml:space="preserve">LBJ National Grassland (NEON site CLBJ), near Decatur, Wise County, about 30 miles northwest of UNT; ~20,000 acres managed by the US Forest Service as grassland.</w:t>
-      </w:r>
-    </w:p>
-    <w:p>
-      <w:pPr>
-        <w:pStyle w:val="ListParagraph"/>
-        <w:numPr>
-          <w:ilvl w:val="0"/>
-          <w:numId w:val="2"/>
-        </w:numPr>
-        <w:spacing w:after="60" w:line="264"/>
-      </w:pPr>
-      <w:r>
-        <w:rPr>
-          <w:b/>
-          <w:bCs/>
-        </w:rPr>
-        <w:t xml:space="preserve">Landscape: </w:t>
-      </w:r>
-      <w:r>
-        <w:t xml:space="preserve">West Cross Timbers oak savanna — a mosaic of post oak/blackjack oak woodland and open grassland, low hills ~245–355 m.</w:t>
-      </w:r>
-    </w:p>
-    <w:p>
-      <w:pPr>
-        <w:pStyle w:val="ListParagraph"/>
-        <w:numPr>
-          <w:ilvl w:val="0"/>
-          <w:numId w:val="2"/>
-        </w:numPr>
-        <w:spacing w:after="60" w:line="264"/>
-      </w:pPr>
-      <w:r>
-        <w:rPr>
-          <w:b/>
-          <w:bCs/>
-        </w:rPr>
-        <w:t xml:space="preserve">Real management problem: </w:t>
-      </w:r>
-      <w:r>
-        <w:t xml:space="preserve">eastern redcedar is invading grassland; the Forest Service uses prescribed fire and cedar removal (e.g., ~5,635 acres burned in the Denton Creek units).</w:t>
-      </w:r>
-    </w:p>
-    <w:p>
-      <w:pPr>
-        <w:pStyle w:val="ListParagraph"/>
-        <w:numPr>
-          <w:ilvl w:val="0"/>
-          <w:numId w:val="2"/>
-        </w:numPr>
-        <w:spacing w:after="60" w:line="264"/>
-      </w:pPr>
-      <w:r>
-        <w:rPr>
-          <w:b/>
-          <w:bCs/>
-        </w:rPr>
-        <w:t xml:space="preserve">Excellent data: </w:t>
-      </w:r>
-      <w:r>
-        <w:t xml:space="preserve">NEON has flown the site nine times (2016–2025) and surveys trees in 47 plots.</w:t>
-      </w:r>
-    </w:p>
-    <w:p>
-      <w:pPr>
-        <w:pStyle w:val="ListParagraph"/>
-        <w:numPr>
-          <w:ilvl w:val="0"/>
-          <w:numId w:val="2"/>
-        </w:numPr>
-        <w:spacing w:after="60" w:line="264"/>
-      </w:pPr>
-      <w:r>
-        <w:rPr>
-          <w:b/>
-          <w:bCs/>
-        </w:rPr>
-        <w:t xml:space="preserve">Under-studied: </w:t>
-      </w:r>
-      <w:r>
-        <w:t xml:space="preserve">tree crown AI has mostly been tested in closed forests; CLBJ was left out of the main NEON crown benchmark.</w:t>
-      </w:r>
-    </w:p>
-    <w:p>
-      <w:pPr>
-        <w:spacing w:after="40" w:before="80"/>
-        <w:jc w:val="center"/>
-      </w:pPr>
-      <w:r>
-        <w:drawing>
-          <wp:inline distT="0" distB="0" distL="0" distR="0">
-            <wp:extent cx="2667000" cy="2752725"/>
-            <wp:effectExtent t="0" r="0" b="0" l="0"/>
-            <wp:docPr id="1" name="" descr="" title=""/>
-            <wp:cNvGraphicFramePr>
-              <a:graphicFrameLocks xmlns:a="http://schemas.openxmlformats.org/drawingml/2006/main" noChangeAspect="1"/>
-            </wp:cNvGraphicFramePr>
-            <a:graphic xmlns:a="http://schemas.openxmlformats.org/drawingml/2006/main">
-              <a:graphicData uri="http://schemas.openxmlformats.org/drawingml/2006/picture">
-                <pic:pic xmlns:pic="http://schemas.openxmlformats.org/drawingml/2006/picture">
-                  <pic:nvPicPr>
-                    <pic:cNvPr id="0" name="" descr=""/>
-                    <pic:cNvPicPr>
-                      <a:picLocks noChangeAspect="1" noChangeArrowheads="1"/>
-                    </pic:cNvPicPr>
-                  </pic:nvPicPr>
-                  <pic:blipFill>
-                    <a:blip r:embed="rId7" cstate="none"/>
-                    <a:srcRect/>
-                    <a:stretch>
-                      <a:fillRect/>
-                    </a:stretch>
-                  </pic:blipFill>
-                  <pic:spPr bwMode="auto">
-                    <a:xfrm>
-                      <a:off x="0" y="0"/>
-                      <a:ext cx="2667000" cy="2752725"/>
-                    </a:xfrm>
-                    <a:prstGeom prst="rect">
-                      <a:avLst/>
-                    </a:prstGeom>
-                  </pic:spPr>
-                </pic:pic>
-              </a:graphicData>
-            </a:graphic>
-          </wp:inline>
-        </w:drawing>
-      </w:r>
-    </w:p>
-    <w:p>
-      <w:pPr>
-        <w:spacing w:after="140"/>
-        <w:jc w:val="center"/>
-      </w:pPr>
-      <w:r>
-        <w:rPr>
-          <w:i/>
-          <w:iCs/>
-          <w:color w:val="555555"/>
-          <w:sz w:val="17"/>
-          <w:szCs w:val="17"/>
-        </w:rPr>
-        <w:t xml:space="preserve">Figure 1. NEON plots at CLBJ by land cover; red circles show plots with juniper; dashed squares are the four 2024 tiles already downloaded.</w:t>
+        <w:t xml:space="preserve">2. Study Area</w:t>
+      </w:r>
+    </w:p>
+    <w:p>
+      <w:pPr>
+        <w:spacing w:after="110" w:line="276"/>
+      </w:pPr>
+      <w:r>
+        <w:t xml:space="preserve">LBJ National Grassland (NEON site CLBJ), Wise County, Texas — an open Cross Timbers oak savanna about 30 miles from UNT, managed by the US Forest Service as grassland, where eastern redcedar (juniper) is encroaching. NEON has flown the site nine times (2016–2025) and surveys trees in 47 plots.</w:t>
       </w:r>
     </w:p>
     <w:p>

</xml_diff>